<commit_message>
Added Templates dropdown list from saved templates in UploadScreen.
</commit_message>
<xml_diff>
--- a/Mahdar Templates/Ar_Mahdar_Template_1.docx
+++ b/Mahdar Templates/Ar_Mahdar_Template_1.docx
@@ -7,7 +7,7 @@
         <w:bidi/>
         <w:jc w:val="right"/>
         <w:rPr>
-          <w:rFonts w:ascii="Arial" w:hAnsi="Arial" w:cs="Arial"/>
+          <w:rFonts w:asciiTheme="majorBidi" w:hAnsiTheme="majorBidi" w:cstheme="majorBidi"/>
           <w:sz w:val="2"/>
           <w:szCs w:val="2"/>
         </w:rPr>
@@ -56,20 +56,20 @@
               <w:bidi/>
               <w:ind w:right="162"/>
               <w:rPr>
-                <w:rFonts w:ascii="Arial" w:hAnsi="Arial" w:cs="Arial"/>
+                <w:rFonts w:asciiTheme="majorBidi" w:hAnsiTheme="majorBidi" w:cstheme="majorBidi"/>
                 <w:color w:val="FFFFFF" w:themeColor="background1"/>
-                <w:sz w:val="28"/>
-                <w:szCs w:val="28"/>
+                <w:sz w:val="24"/>
+                <w:szCs w:val="24"/>
               </w:rPr>
             </w:pPr>
             <w:bookmarkStart w:id="0" w:name="_Hlk487665564"/>
             <w:bookmarkStart w:id="1" w:name="_Hlk487712651"/>
             <w:r>
               <w:rPr>
-                <w:rFonts w:ascii="Arial" w:hAnsi="Arial" w:cs="Arial"/>
+                <w:rFonts w:asciiTheme="majorBidi" w:hAnsiTheme="majorBidi" w:cstheme="majorBidi"/>
                 <w:color w:val="FFFFFF" w:themeColor="background1"/>
-                <w:sz w:val="28"/>
-                <w:szCs w:val="28"/>
+                <w:sz w:val="24"/>
+                <w:szCs w:val="24"/>
                 <w:rtl/>
               </w:rPr>
               <w:t>الموضوع</w:t>
@@ -96,7 +96,7 @@
               <w:bidi/>
               <w:ind w:right="162"/>
               <w:rPr>
-                <w:rFonts w:ascii="Arial" w:hAnsi="Arial" w:cs="Arial"/>
+                <w:rFonts w:asciiTheme="majorBidi" w:hAnsiTheme="majorBidi" w:cstheme="majorBidi"/>
                 <w:sz w:val="20"/>
                 <w:szCs w:val="20"/>
                 <w:rtl/>
@@ -104,7 +104,7 @@
             </w:pPr>
             <w:r>
               <w:rPr>
-                <w:rFonts w:ascii="Arial" w:hAnsi="Arial" w:cs="Arial"/>
+                <w:rFonts w:asciiTheme="majorBidi" w:hAnsiTheme="majorBidi" w:cstheme="majorBidi"/>
                 <w:sz w:val="20"/>
                 <w:szCs w:val="20"/>
               </w:rPr>
@@ -137,18 +137,18 @@
               <w:bidi/>
               <w:ind w:right="162"/>
               <w:rPr>
-                <w:rFonts w:ascii="Arial" w:hAnsi="Arial" w:cs="Arial"/>
+                <w:rFonts w:asciiTheme="majorBidi" w:hAnsiTheme="majorBidi" w:cstheme="majorBidi"/>
                 <w:color w:val="FFFFFF" w:themeColor="background1"/>
-                <w:sz w:val="28"/>
-                <w:szCs w:val="28"/>
+                <w:sz w:val="24"/>
+                <w:szCs w:val="24"/>
               </w:rPr>
             </w:pPr>
             <w:r>
               <w:rPr>
-                <w:rFonts w:ascii="Arial" w:hAnsi="Arial" w:cs="Arial"/>
+                <w:rFonts w:asciiTheme="majorBidi" w:hAnsiTheme="majorBidi" w:cstheme="majorBidi"/>
                 <w:color w:val="FFFFFF" w:themeColor="background1"/>
-                <w:sz w:val="28"/>
-                <w:szCs w:val="28"/>
+                <w:sz w:val="24"/>
+                <w:szCs w:val="24"/>
                 <w:rtl/>
               </w:rPr>
               <w:t>التاريخ</w:t>
@@ -175,7 +175,7 @@
               <w:bidi/>
               <w:ind w:right="162"/>
               <w:rPr>
-                <w:rFonts w:ascii="Arial" w:hAnsi="Arial" w:cs="Arial"/>
+                <w:rFonts w:asciiTheme="majorBidi" w:hAnsiTheme="majorBidi" w:cstheme="majorBidi"/>
                 <w:sz w:val="20"/>
                 <w:szCs w:val="20"/>
                 <w:lang w:bidi="ar-JO"/>
@@ -183,7 +183,7 @@
             </w:pPr>
             <w:r>
               <w:rPr>
-                <w:rFonts w:ascii="Arial" w:hAnsi="Arial" w:cs="Arial"/>
+                <w:rFonts w:asciiTheme="majorBidi" w:hAnsiTheme="majorBidi" w:cstheme="majorBidi"/>
                 <w:sz w:val="20"/>
                 <w:szCs w:val="20"/>
                 <w:lang w:bidi="ar-JO"/>
@@ -193,7 +193,7 @@
             <w:proofErr w:type="spellStart"/>
             <w:r>
               <w:rPr>
-                <w:rFonts w:ascii="Arial" w:hAnsi="Arial" w:cs="Arial"/>
+                <w:rFonts w:asciiTheme="majorBidi" w:hAnsiTheme="majorBidi" w:cstheme="majorBidi"/>
                 <w:sz w:val="20"/>
                 <w:szCs w:val="20"/>
                 <w:lang w:bidi="ar-JO"/>
@@ -203,7 +203,7 @@
             <w:proofErr w:type="spellEnd"/>
             <w:r>
               <w:rPr>
-                <w:rFonts w:ascii="Arial" w:hAnsi="Arial" w:cs="Arial"/>
+                <w:rFonts w:asciiTheme="majorBidi" w:hAnsiTheme="majorBidi" w:cstheme="majorBidi"/>
                 <w:sz w:val="20"/>
                 <w:szCs w:val="20"/>
                 <w:lang w:bidi="ar-JO"/>
@@ -212,52 +212,32 @@
             </w:r>
             <w:r>
               <w:rPr>
-                <w:rFonts w:ascii="Sakkal Majalla" w:hAnsi="Sakkal Majalla" w:cs="Sakkal Majalla" w:hint="cs"/>
+                <w:rFonts w:asciiTheme="majorBidi" w:hAnsiTheme="majorBidi" w:cstheme="majorBidi"/>
                 <w:sz w:val="20"/>
                 <w:szCs w:val="20"/>
                 <w:rtl/>
                 <w:lang w:bidi="ar-JO"/>
               </w:rPr>
-              <w:t>الموافق</w:t>
-            </w:r>
-            <w:r>
-              <w:rPr>
-                <w:rFonts w:ascii="Arial" w:hAnsi="Arial" w:cs="Arial"/>
+              <w:t>الموافق {{</w:t>
+            </w:r>
+            <w:r>
+              <w:rPr>
+                <w:rFonts w:asciiTheme="majorBidi" w:hAnsiTheme="majorBidi" w:cstheme="majorBidi"/>
+                <w:sz w:val="20"/>
+                <w:szCs w:val="20"/>
+                <w:lang w:bidi="ar-JO"/>
+              </w:rPr>
+              <w:t>date</w:t>
+            </w:r>
+            <w:r>
+              <w:rPr>
+                <w:rFonts w:asciiTheme="majorBidi" w:hAnsiTheme="majorBidi" w:cstheme="majorBidi"/>
                 <w:sz w:val="20"/>
                 <w:szCs w:val="20"/>
                 <w:rtl/>
                 <w:lang w:bidi="ar-JO"/>
               </w:rPr>
-              <w:t xml:space="preserve"> {{</w:t>
-            </w:r>
-            <w:r>
-              <w:rPr>
-                <w:rFonts w:ascii="Arial" w:hAnsi="Arial" w:cs="Arial"/>
-                <w:sz w:val="20"/>
-                <w:szCs w:val="20"/>
-                <w:lang w:bidi="ar-JO"/>
-              </w:rPr>
-              <w:t>date</w:t>
-            </w:r>
-            <w:r>
-              <w:rPr>
-                <w:rFonts w:ascii="Arial" w:hAnsi="Arial" w:cs="Arial"/>
-                <w:sz w:val="20"/>
-                <w:szCs w:val="20"/>
-                <w:rtl/>
-                <w:lang w:bidi="ar-JO"/>
-              </w:rPr>
-              <w:t>}}</w:t>
-            </w:r>
-            <w:r>
-              <w:rPr>
-                <w:rFonts w:ascii="Sakkal Majalla" w:hAnsi="Sakkal Majalla" w:cs="Sakkal Majalla" w:hint="cs"/>
-                <w:sz w:val="20"/>
-                <w:szCs w:val="20"/>
-                <w:rtl/>
-                <w:lang w:bidi="ar-JO"/>
-              </w:rPr>
-              <w:t>م</w:t>
+              <w:t>}}م</w:t>
             </w:r>
           </w:p>
         </w:tc>
@@ -284,18 +264,18 @@
               <w:bidi/>
               <w:ind w:right="162"/>
               <w:rPr>
-                <w:rFonts w:ascii="Arial" w:hAnsi="Arial" w:cs="Arial"/>
+                <w:rFonts w:asciiTheme="majorBidi" w:hAnsiTheme="majorBidi" w:cstheme="majorBidi"/>
                 <w:color w:val="FFFFFF" w:themeColor="background1"/>
-                <w:sz w:val="28"/>
-                <w:szCs w:val="28"/>
+                <w:sz w:val="24"/>
+                <w:szCs w:val="24"/>
               </w:rPr>
             </w:pPr>
             <w:r>
               <w:rPr>
-                <w:rFonts w:ascii="Arial" w:hAnsi="Arial" w:cs="Arial"/>
+                <w:rFonts w:asciiTheme="majorBidi" w:hAnsiTheme="majorBidi" w:cstheme="majorBidi"/>
                 <w:color w:val="FFFFFF" w:themeColor="background1"/>
-                <w:sz w:val="28"/>
-                <w:szCs w:val="28"/>
+                <w:sz w:val="24"/>
+                <w:szCs w:val="24"/>
                 <w:rtl/>
               </w:rPr>
               <w:t>المكان</w:t>
@@ -322,14 +302,14 @@
               <w:bidi/>
               <w:ind w:right="162"/>
               <w:rPr>
-                <w:rFonts w:ascii="Arial" w:hAnsi="Arial" w:cs="Arial"/>
+                <w:rFonts w:asciiTheme="majorBidi" w:hAnsiTheme="majorBidi" w:cstheme="majorBidi"/>
                 <w:sz w:val="20"/>
                 <w:szCs w:val="20"/>
               </w:rPr>
             </w:pPr>
             <w:r>
               <w:rPr>
-                <w:rFonts w:ascii="Arial" w:hAnsi="Arial" w:cs="Arial"/>
+                <w:rFonts w:asciiTheme="majorBidi" w:hAnsiTheme="majorBidi" w:cstheme="majorBidi"/>
                 <w:sz w:val="20"/>
                 <w:szCs w:val="20"/>
               </w:rPr>
@@ -360,20 +340,20 @@
               <w:bidi/>
               <w:ind w:right="162"/>
               <w:rPr>
-                <w:rFonts w:ascii="Arial" w:hAnsi="Arial" w:cs="Sakkal Majalla" w:hint="cs"/>
+                <w:rFonts w:asciiTheme="majorBidi" w:hAnsiTheme="majorBidi" w:cstheme="majorBidi"/>
                 <w:color w:val="FFFFFF" w:themeColor="background1"/>
-                <w:sz w:val="28"/>
-                <w:szCs w:val="28"/>
+                <w:sz w:val="24"/>
+                <w:szCs w:val="24"/>
                 <w:rtl/>
                 <w:lang w:bidi="ar-JO"/>
               </w:rPr>
             </w:pPr>
             <w:r>
               <w:rPr>
-                <w:rFonts w:ascii="Arial" w:hAnsi="Arial" w:cs="Sakkal Majalla" w:hint="cs"/>
+                <w:rFonts w:asciiTheme="majorBidi" w:hAnsiTheme="majorBidi" w:cstheme="majorBidi"/>
                 <w:color w:val="FFFFFF" w:themeColor="background1"/>
-                <w:sz w:val="28"/>
-                <w:szCs w:val="28"/>
+                <w:sz w:val="24"/>
+                <w:szCs w:val="24"/>
                 <w:rtl/>
                 <w:lang w:bidi="ar-JO"/>
               </w:rPr>
@@ -401,14 +381,14 @@
               <w:bidi/>
               <w:ind w:right="162"/>
               <w:rPr>
-                <w:rFonts w:ascii="Arial" w:hAnsi="Arial" w:cs="Arial"/>
+                <w:rFonts w:asciiTheme="majorBidi" w:hAnsiTheme="majorBidi" w:cstheme="majorBidi"/>
                 <w:sz w:val="20"/>
                 <w:szCs w:val="20"/>
               </w:rPr>
             </w:pPr>
             <w:r>
               <w:rPr>
-                <w:rFonts w:ascii="Arial" w:hAnsi="Arial" w:cs="Arial"/>
+                <w:rFonts w:asciiTheme="majorBidi" w:hAnsiTheme="majorBidi" w:cstheme="majorBidi"/>
                 <w:sz w:val="20"/>
                 <w:szCs w:val="20"/>
                 <w:lang w:bidi="ar-JO"/>
@@ -418,82 +398,53 @@
             <w:proofErr w:type="spellStart"/>
             <w:r>
               <w:rPr>
-                <w:rFonts w:ascii="Arial" w:hAnsi="Arial" w:cs="Arial"/>
+                <w:rFonts w:asciiTheme="majorBidi" w:hAnsiTheme="majorBidi" w:cstheme="majorBidi"/>
                 <w:sz w:val="20"/>
                 <w:szCs w:val="20"/>
                 <w:lang w:bidi="ar-JO"/>
               </w:rPr>
-              <w:t>hijri_</w:t>
-            </w:r>
-            <w:r>
-              <w:rPr>
-                <w:rFonts w:ascii="Arial" w:hAnsi="Arial" w:cs="Arial"/>
+              <w:t>hijri_next_meeting</w:t>
+            </w:r>
+            <w:proofErr w:type="spellEnd"/>
+            <w:r>
+              <w:rPr>
+                <w:rFonts w:asciiTheme="majorBidi" w:hAnsiTheme="majorBidi" w:cstheme="majorBidi"/>
                 <w:sz w:val="20"/>
                 <w:szCs w:val="20"/>
                 <w:lang w:bidi="ar-JO"/>
               </w:rPr>
-              <w:t>next_meeting</w:t>
-            </w:r>
-            <w:proofErr w:type="spellEnd"/>
-            <w:r>
-              <w:rPr>
-                <w:rFonts w:ascii="Arial" w:hAnsi="Arial" w:cs="Arial"/>
-                <w:sz w:val="20"/>
-                <w:szCs w:val="20"/>
-                <w:lang w:bidi="ar-JO"/>
-              </w:rPr>
               <w:t>}}</w:t>
             </w:r>
             <w:r>
               <w:rPr>
-                <w:rFonts w:ascii="Sakkal Majalla" w:hAnsi="Sakkal Majalla" w:cs="Sakkal Majalla" w:hint="cs"/>
+                <w:rFonts w:asciiTheme="majorBidi" w:hAnsiTheme="majorBidi" w:cstheme="majorBidi"/>
                 <w:sz w:val="20"/>
                 <w:szCs w:val="20"/>
                 <w:rtl/>
                 <w:lang w:bidi="ar-JO"/>
               </w:rPr>
-              <w:t>الموافق</w:t>
-            </w:r>
-            <w:r>
-              <w:rPr>
-                <w:rFonts w:ascii="Arial" w:hAnsi="Arial" w:cs="Arial"/>
+              <w:t>الموافق {{</w:t>
+            </w:r>
+            <w:proofErr w:type="spellStart"/>
+            <w:r>
+              <w:rPr>
+                <w:rFonts w:asciiTheme="majorBidi" w:hAnsiTheme="majorBidi" w:cstheme="majorBidi"/>
+                <w:sz w:val="20"/>
+                <w:szCs w:val="20"/>
+                <w:lang w:bidi="ar-JO"/>
+              </w:rPr>
+              <w:t>next_meeting</w:t>
+            </w:r>
+            <w:proofErr w:type="spellEnd"/>
+            <w:r>
+              <w:rPr>
+                <w:rFonts w:asciiTheme="majorBidi" w:hAnsiTheme="majorBidi" w:cstheme="majorBidi"/>
                 <w:sz w:val="20"/>
                 <w:szCs w:val="20"/>
                 <w:rtl/>
                 <w:lang w:bidi="ar-JO"/>
               </w:rPr>
-              <w:t xml:space="preserve"> {{</w:t>
-            </w:r>
-            <w:proofErr w:type="spellStart"/>
-            <w:r>
-              <w:rPr>
-                <w:rFonts w:ascii="Arial" w:hAnsi="Arial" w:cs="Arial"/>
-                <w:sz w:val="20"/>
-                <w:szCs w:val="20"/>
-                <w:lang w:bidi="ar-JO"/>
-              </w:rPr>
-              <w:t>next_meeting</w:t>
-            </w:r>
-            <w:proofErr w:type="spellEnd"/>
-            <w:r>
-              <w:rPr>
-                <w:rFonts w:ascii="Arial" w:hAnsi="Arial" w:cs="Arial"/>
-                <w:sz w:val="20"/>
-                <w:szCs w:val="20"/>
-                <w:rtl/>
-                <w:lang w:bidi="ar-JO"/>
-              </w:rPr>
-              <w:t>}}</w:t>
-            </w:r>
-            <w:r>
-              <w:rPr>
-                <w:rFonts w:ascii="Sakkal Majalla" w:hAnsi="Sakkal Majalla" w:cs="Sakkal Majalla" w:hint="cs"/>
-                <w:sz w:val="20"/>
-                <w:szCs w:val="20"/>
-                <w:rtl/>
-                <w:lang w:bidi="ar-JO"/>
-              </w:rPr>
-              <w:t>م</w:t>
+              <w:t>}}م</w:t>
             </w:r>
           </w:p>
         </w:tc>
@@ -501,15 +452,30 @@
     </w:tbl>
     <w:p>
       <w:pPr>
+        <w:pBdr>
+          <w:bottom w:val="single" w:sz="6" w:space="1" w:color="2E75B6"/>
+        </w:pBdr>
         <w:bidi/>
-        <w:jc w:val="right"/>
+        <w:spacing w:before="320"/>
         <w:rPr>
-          <w:rFonts w:ascii="Arial" w:hAnsi="Arial" w:cs="Arial"/>
-          <w:sz w:val="28"/>
+          <w:rFonts w:asciiTheme="majorBidi" w:hAnsiTheme="majorBidi" w:cstheme="majorBidi"/>
+          <w:sz w:val="32"/>
           <w:szCs w:val="32"/>
           <w:rtl/>
         </w:rPr>
       </w:pPr>
+      <w:r>
+        <w:rPr>
+          <w:rFonts w:asciiTheme="majorBidi" w:hAnsiTheme="majorBidi" w:cstheme="majorBidi"/>
+          <w:b/>
+          <w:bCs/>
+          <w:color w:val="1F3864"/>
+          <w:sz w:val="36"/>
+          <w:szCs w:val="36"/>
+          <w:rtl/>
+        </w:rPr>
+        <w:t>الحضور</w:t>
+      </w:r>
     </w:p>
     <w:tbl>
       <w:tblPr>
@@ -540,48 +506,8 @@
         </w:trPr>
         <w:tc>
           <w:tcPr>
-            <w:tcW w:w="5000" w:type="pct"/>
-            <w:gridSpan w:val="3"/>
+            <w:tcW w:w="1778" w:type="pct"/>
             <w:shd w:val="clear" w:color="auto" w:fill="1F3864"/>
-          </w:tcPr>
-          <w:p>
-            <w:pPr>
-              <w:tabs>
-                <w:tab w:val="left" w:pos="1692"/>
-                <w:tab w:val="center" w:pos="5256"/>
-              </w:tabs>
-              <w:bidi/>
-              <w:spacing w:after="0" w:line="240" w:lineRule="auto"/>
-              <w:ind w:right="162"/>
-              <w:jc w:val="center"/>
-              <w:rPr>
-                <w:rFonts w:ascii="Arial" w:hAnsi="Arial" w:cs="Arial"/>
-                <w:color w:val="FFFFFF" w:themeColor="background1"/>
-                <w:sz w:val="36"/>
-                <w:szCs w:val="36"/>
-              </w:rPr>
-            </w:pPr>
-            <w:r>
-              <w:rPr>
-                <w:rFonts w:ascii="Arial" w:hAnsi="Arial" w:cs="Arial"/>
-                <w:color w:val="FFFFFF" w:themeColor="background1"/>
-                <w:sz w:val="36"/>
-                <w:szCs w:val="36"/>
-                <w:rtl/>
-              </w:rPr>
-              <w:t>الحضور</w:t>
-            </w:r>
-          </w:p>
-        </w:tc>
-      </w:tr>
-      <w:tr>
-        <w:trPr>
-          <w:trHeight w:val="195"/>
-        </w:trPr>
-        <w:tc>
-          <w:tcPr>
-            <w:tcW w:w="1778" w:type="pct"/>
-            <w:shd w:val="clear" w:color="auto" w:fill="D6E4F0"/>
             <w:tcMar>
               <w:top w:w="72" w:type="dxa"/>
               <w:left w:w="144" w:type="dxa"/>
@@ -600,20 +526,20 @@
               <w:ind w:right="162"/>
               <w:jc w:val="center"/>
               <w:rPr>
-                <w:rFonts w:ascii="Arial" w:hAnsi="Arial" w:cs="Arial"/>
+                <w:rFonts w:asciiTheme="majorBidi" w:hAnsiTheme="majorBidi" w:cstheme="majorBidi"/>
                 <w:b/>
                 <w:bCs/>
-                <w:color w:val="1F3864"/>
+                <w:color w:val="FFFFFF" w:themeColor="background1"/>
                 <w:sz w:val="24"/>
                 <w:szCs w:val="24"/>
               </w:rPr>
             </w:pPr>
             <w:r>
               <w:rPr>
-                <w:rFonts w:ascii="Arial" w:hAnsi="Arial" w:cs="Arial"/>
+                <w:rFonts w:asciiTheme="majorBidi" w:hAnsiTheme="majorBidi" w:cstheme="majorBidi"/>
                 <w:b/>
                 <w:bCs/>
-                <w:color w:val="1F3864"/>
+                <w:color w:val="FFFFFF" w:themeColor="background1"/>
                 <w:sz w:val="24"/>
                 <w:szCs w:val="24"/>
                 <w:rtl/>
@@ -625,7 +551,7 @@
         <w:tc>
           <w:tcPr>
             <w:tcW w:w="1573" w:type="pct"/>
-            <w:shd w:val="clear" w:color="auto" w:fill="D6E4F0"/>
+            <w:shd w:val="clear" w:color="auto" w:fill="1F3864"/>
           </w:tcPr>
           <w:p>
             <w:pPr>
@@ -638,10 +564,10 @@
               <w:ind w:right="162"/>
               <w:jc w:val="center"/>
               <w:rPr>
-                <w:rFonts w:ascii="Arial" w:hAnsi="Arial" w:cs="Arial"/>
+                <w:rFonts w:asciiTheme="majorBidi" w:hAnsiTheme="majorBidi" w:cstheme="majorBidi"/>
                 <w:b/>
                 <w:bCs/>
-                <w:color w:val="1F3864"/>
+                <w:color w:val="FFFFFF" w:themeColor="background1"/>
                 <w:sz w:val="24"/>
                 <w:szCs w:val="24"/>
                 <w:rtl/>
@@ -650,10 +576,10 @@
             </w:pPr>
             <w:r>
               <w:rPr>
-                <w:rFonts w:ascii="Arial" w:hAnsi="Arial" w:cs="Arial"/>
+                <w:rFonts w:asciiTheme="majorBidi" w:hAnsiTheme="majorBidi" w:cstheme="majorBidi"/>
                 <w:b/>
                 <w:bCs/>
-                <w:color w:val="1F3864"/>
+                <w:color w:val="FFFFFF" w:themeColor="background1"/>
                 <w:sz w:val="24"/>
                 <w:szCs w:val="24"/>
                 <w:rtl/>
@@ -666,7 +592,7 @@
         <w:tc>
           <w:tcPr>
             <w:tcW w:w="1649" w:type="pct"/>
-            <w:shd w:val="clear" w:color="auto" w:fill="D6E4F0"/>
+            <w:shd w:val="clear" w:color="auto" w:fill="1F3864"/>
           </w:tcPr>
           <w:p>
             <w:pPr>
@@ -679,20 +605,20 @@
               <w:ind w:right="162"/>
               <w:jc w:val="center"/>
               <w:rPr>
-                <w:rFonts w:ascii="Arial" w:hAnsi="Arial" w:cs="Arial"/>
+                <w:rFonts w:asciiTheme="majorBidi" w:hAnsiTheme="majorBidi" w:cstheme="majorBidi"/>
                 <w:b/>
                 <w:bCs/>
-                <w:color w:val="1F3864"/>
+                <w:color w:val="FFFFFF" w:themeColor="background1"/>
                 <w:sz w:val="24"/>
                 <w:szCs w:val="24"/>
               </w:rPr>
             </w:pPr>
             <w:r>
               <w:rPr>
-                <w:rFonts w:ascii="Arial" w:hAnsi="Arial" w:cs="Arial"/>
+                <w:rFonts w:asciiTheme="majorBidi" w:hAnsiTheme="majorBidi" w:cstheme="majorBidi"/>
                 <w:b/>
                 <w:bCs/>
-                <w:color w:val="1F3864"/>
+                <w:color w:val="FFFFFF" w:themeColor="background1"/>
                 <w:sz w:val="24"/>
                 <w:szCs w:val="24"/>
                 <w:rtl/>
@@ -726,7 +652,7 @@
               <w:spacing w:after="0" w:line="240" w:lineRule="auto"/>
               <w:ind w:right="162"/>
               <w:rPr>
-                <w:rFonts w:ascii="Arial" w:hAnsi="Arial" w:cs="Arial"/>
+                <w:rFonts w:asciiTheme="majorBidi" w:hAnsiTheme="majorBidi" w:cstheme="majorBidi"/>
                 <w:sz w:val="20"/>
                 <w:szCs w:val="20"/>
               </w:rPr>
@@ -747,7 +673,7 @@
               <w:spacing w:after="0" w:line="240" w:lineRule="auto"/>
               <w:ind w:left="2052" w:right="162"/>
               <w:rPr>
-                <w:rFonts w:ascii="Arial" w:hAnsi="Arial" w:cs="Arial"/>
+                <w:rFonts w:asciiTheme="majorBidi" w:hAnsiTheme="majorBidi" w:cstheme="majorBidi"/>
                 <w:sz w:val="20"/>
                 <w:szCs w:val="20"/>
                 <w:rtl/>
@@ -758,23 +684,154 @@
         <w:tc>
           <w:tcPr>
             <w:tcW w:w="1649" w:type="pct"/>
+            <w:vAlign w:val="center"/>
           </w:tcPr>
           <w:p>
             <w:pPr>
-              <w:pStyle w:val="ListParagraph"/>
               <w:tabs>
                 <w:tab w:val="left" w:pos="1692"/>
               </w:tabs>
               <w:bidi/>
               <w:spacing w:after="0" w:line="240" w:lineRule="auto"/>
-              <w:ind w:left="2052" w:right="162"/>
-              <w:rPr>
-                <w:rFonts w:ascii="Arial" w:hAnsi="Arial" w:cs="Arial"/>
+              <w:ind w:right="162"/>
+              <w:rPr>
+                <w:rFonts w:asciiTheme="majorBidi" w:hAnsiTheme="majorBidi" w:cstheme="majorBidi"/>
+                <w:sz w:val="20"/>
+                <w:szCs w:val="20"/>
+              </w:rPr>
+            </w:pPr>
+            <w:r>
+              <w:rPr>
+                <w:rFonts w:asciiTheme="majorBidi" w:hAnsiTheme="majorBidi" w:cstheme="majorBidi"/>
+              </w:rPr>
+              <w:t>{%tr for item in attendees %}</w:t>
+            </w:r>
+          </w:p>
+        </w:tc>
+      </w:tr>
+      <w:tr>
+        <w:trPr>
+          <w:trHeight w:val="265"/>
+        </w:trPr>
+        <w:tc>
+          <w:tcPr>
+            <w:tcW w:w="1778" w:type="pct"/>
+            <w:tcMar>
+              <w:top w:w="72" w:type="dxa"/>
+              <w:left w:w="144" w:type="dxa"/>
+              <w:bottom w:w="72" w:type="dxa"/>
+              <w:right w:w="144" w:type="dxa"/>
+            </w:tcMar>
+            <w:vAlign w:val="center"/>
+          </w:tcPr>
+          <w:p>
+            <w:pPr>
+              <w:tabs>
+                <w:tab w:val="left" w:pos="1692"/>
+                <w:tab w:val="center" w:pos="5256"/>
+              </w:tabs>
+              <w:bidi/>
+              <w:spacing w:after="0" w:line="240" w:lineRule="auto"/>
+              <w:ind w:right="162"/>
+              <w:rPr>
+                <w:rFonts w:asciiTheme="majorBidi" w:hAnsiTheme="majorBidi" w:cstheme="majorBidi"/>
                 <w:sz w:val="20"/>
                 <w:szCs w:val="20"/>
                 <w:rtl/>
               </w:rPr>
             </w:pPr>
+            <w:r>
+              <w:rPr>
+                <w:rFonts w:asciiTheme="majorBidi" w:hAnsiTheme="majorBidi" w:cstheme="majorBidi"/>
+              </w:rPr>
+              <w:t xml:space="preserve">{{ </w:t>
+            </w:r>
+            <w:proofErr w:type="spellStart"/>
+            <w:r>
+              <w:rPr>
+                <w:rFonts w:asciiTheme="majorBidi" w:hAnsiTheme="majorBidi" w:cstheme="majorBidi"/>
+              </w:rPr>
+              <w:t>item.role</w:t>
+            </w:r>
+            <w:proofErr w:type="spellEnd"/>
+            <w:r>
+              <w:rPr>
+                <w:rFonts w:asciiTheme="majorBidi" w:hAnsiTheme="majorBidi" w:cstheme="majorBidi"/>
+              </w:rPr>
+              <w:t xml:space="preserve"> }}</w:t>
+            </w:r>
+          </w:p>
+        </w:tc>
+        <w:tc>
+          <w:tcPr>
+            <w:tcW w:w="1573" w:type="pct"/>
+            <w:vAlign w:val="center"/>
+          </w:tcPr>
+          <w:p>
+            <w:pPr>
+              <w:tabs>
+                <w:tab w:val="left" w:pos="1692"/>
+                <w:tab w:val="center" w:pos="5256"/>
+              </w:tabs>
+              <w:bidi/>
+              <w:spacing w:after="0" w:line="240" w:lineRule="auto"/>
+              <w:ind w:right="162"/>
+              <w:rPr>
+                <w:rFonts w:asciiTheme="majorBidi" w:hAnsiTheme="majorBidi" w:cstheme="majorBidi"/>
+                <w:sz w:val="20"/>
+                <w:szCs w:val="20"/>
+                <w:rtl/>
+              </w:rPr>
+            </w:pPr>
+            <w:r>
+              <w:rPr>
+                <w:rFonts w:asciiTheme="majorBidi" w:hAnsiTheme="majorBidi" w:cstheme="majorBidi"/>
+              </w:rPr>
+              <w:t xml:space="preserve">{{ </w:t>
+            </w:r>
+            <w:proofErr w:type="spellStart"/>
+            <w:r>
+              <w:rPr>
+                <w:rFonts w:asciiTheme="majorBidi" w:hAnsiTheme="majorBidi" w:cstheme="majorBidi"/>
+              </w:rPr>
+              <w:t>item.email</w:t>
+            </w:r>
+            <w:proofErr w:type="spellEnd"/>
+            <w:r>
+              <w:rPr>
+                <w:rFonts w:asciiTheme="majorBidi" w:hAnsiTheme="majorBidi" w:cstheme="majorBidi"/>
+              </w:rPr>
+              <w:t xml:space="preserve"> }}</w:t>
+            </w:r>
+          </w:p>
+        </w:tc>
+        <w:tc>
+          <w:tcPr>
+            <w:tcW w:w="1649" w:type="pct"/>
+            <w:vAlign w:val="center"/>
+          </w:tcPr>
+          <w:p>
+            <w:pPr>
+              <w:tabs>
+                <w:tab w:val="left" w:pos="1692"/>
+                <w:tab w:val="center" w:pos="5256"/>
+              </w:tabs>
+              <w:bidi/>
+              <w:spacing w:after="0" w:line="240" w:lineRule="auto"/>
+              <w:ind w:right="162"/>
+              <w:rPr>
+                <w:rFonts w:asciiTheme="majorBidi" w:hAnsiTheme="majorBidi" w:cstheme="majorBidi"/>
+                <w:sz w:val="20"/>
+                <w:szCs w:val="20"/>
+                <w:rtl/>
+              </w:rPr>
+            </w:pPr>
+            <w:r>
+              <w:rPr>
+                <w:rFonts w:asciiTheme="majorBidi" w:hAnsiTheme="majorBidi" w:cstheme="majorBidi"/>
+              </w:rPr>
+              <w:t>{{ item.name }}</w:t>
+            </w:r>
           </w:p>
         </w:tc>
       </w:tr>
@@ -802,7 +859,7 @@
               <w:spacing w:after="0" w:line="240" w:lineRule="auto"/>
               <w:ind w:right="162"/>
               <w:rPr>
-                <w:rFonts w:ascii="Arial" w:hAnsi="Arial" w:cs="Arial"/>
+                <w:rFonts w:asciiTheme="majorBidi" w:hAnsiTheme="majorBidi" w:cstheme="majorBidi"/>
                 <w:sz w:val="20"/>
                 <w:szCs w:val="20"/>
                 <w:rtl/>
@@ -824,7 +881,7 @@
               <w:spacing w:after="0" w:line="240" w:lineRule="auto"/>
               <w:ind w:right="162"/>
               <w:rPr>
-                <w:rFonts w:ascii="Arial" w:hAnsi="Arial" w:cs="Arial"/>
+                <w:rFonts w:asciiTheme="majorBidi" w:hAnsiTheme="majorBidi" w:cstheme="majorBidi"/>
                 <w:sz w:val="20"/>
                 <w:szCs w:val="20"/>
                 <w:rtl/>
@@ -835,6 +892,7 @@
         <w:tc>
           <w:tcPr>
             <w:tcW w:w="1649" w:type="pct"/>
+            <w:vAlign w:val="center"/>
           </w:tcPr>
           <w:p>
             <w:pPr>
@@ -846,318 +904,32 @@
               <w:spacing w:after="0" w:line="240" w:lineRule="auto"/>
               <w:ind w:right="162"/>
               <w:rPr>
-                <w:rFonts w:ascii="Arial" w:hAnsi="Arial" w:cs="Arial"/>
+                <w:rFonts w:asciiTheme="majorBidi" w:hAnsiTheme="majorBidi" w:cstheme="majorBidi"/>
                 <w:sz w:val="20"/>
                 <w:szCs w:val="20"/>
                 <w:rtl/>
               </w:rPr>
             </w:pPr>
-          </w:p>
-        </w:tc>
-      </w:tr>
-      <w:tr>
-        <w:trPr>
-          <w:trHeight w:val="265"/>
-        </w:trPr>
-        <w:tc>
-          <w:tcPr>
-            <w:tcW w:w="1778" w:type="pct"/>
-            <w:tcMar>
-              <w:top w:w="72" w:type="dxa"/>
-              <w:left w:w="144" w:type="dxa"/>
-              <w:bottom w:w="72" w:type="dxa"/>
-              <w:right w:w="144" w:type="dxa"/>
-            </w:tcMar>
-          </w:tcPr>
-          <w:p>
-            <w:pPr>
-              <w:tabs>
-                <w:tab w:val="left" w:pos="1692"/>
-                <w:tab w:val="center" w:pos="5256"/>
-              </w:tabs>
-              <w:bidi/>
-              <w:spacing w:after="0" w:line="240" w:lineRule="auto"/>
-              <w:ind w:right="162"/>
-              <w:rPr>
-                <w:rFonts w:ascii="Arial" w:hAnsi="Arial" w:cs="Arial"/>
-                <w:sz w:val="20"/>
-                <w:szCs w:val="20"/>
-                <w:rtl/>
-              </w:rPr>
-            </w:pPr>
-          </w:p>
-        </w:tc>
-        <w:tc>
-          <w:tcPr>
-            <w:tcW w:w="1573" w:type="pct"/>
-          </w:tcPr>
-          <w:p>
-            <w:pPr>
-              <w:tabs>
-                <w:tab w:val="left" w:pos="1692"/>
-                <w:tab w:val="center" w:pos="5256"/>
-              </w:tabs>
-              <w:bidi/>
-              <w:spacing w:after="0" w:line="240" w:lineRule="auto"/>
-              <w:ind w:right="162"/>
-              <w:rPr>
-                <w:rFonts w:ascii="Arial" w:hAnsi="Arial" w:cs="Arial"/>
-                <w:sz w:val="20"/>
-                <w:szCs w:val="20"/>
-                <w:rtl/>
-              </w:rPr>
-            </w:pPr>
-          </w:p>
-        </w:tc>
-        <w:tc>
-          <w:tcPr>
-            <w:tcW w:w="1649" w:type="pct"/>
-          </w:tcPr>
-          <w:p>
-            <w:pPr>
-              <w:tabs>
-                <w:tab w:val="left" w:pos="1692"/>
-                <w:tab w:val="center" w:pos="5256"/>
-              </w:tabs>
-              <w:bidi/>
-              <w:spacing w:after="0" w:line="240" w:lineRule="auto"/>
-              <w:ind w:right="162"/>
-              <w:rPr>
-                <w:rFonts w:ascii="Arial" w:hAnsi="Arial" w:cs="Arial"/>
-                <w:sz w:val="20"/>
-                <w:szCs w:val="20"/>
-                <w:rtl/>
-              </w:rPr>
-            </w:pPr>
-          </w:p>
-        </w:tc>
-      </w:tr>
-      <w:tr>
-        <w:trPr>
-          <w:trHeight w:val="265"/>
-        </w:trPr>
-        <w:tc>
-          <w:tcPr>
-            <w:tcW w:w="1778" w:type="pct"/>
-            <w:tcMar>
-              <w:top w:w="72" w:type="dxa"/>
-              <w:left w:w="144" w:type="dxa"/>
-              <w:bottom w:w="72" w:type="dxa"/>
-              <w:right w:w="144" w:type="dxa"/>
-            </w:tcMar>
-          </w:tcPr>
-          <w:p>
-            <w:pPr>
-              <w:tabs>
-                <w:tab w:val="left" w:pos="1692"/>
-                <w:tab w:val="center" w:pos="5256"/>
-              </w:tabs>
-              <w:bidi/>
-              <w:spacing w:after="0" w:line="240" w:lineRule="auto"/>
-              <w:ind w:right="162"/>
-              <w:rPr>
-                <w:rFonts w:ascii="Arial" w:hAnsi="Arial" w:cs="Arial"/>
-                <w:sz w:val="20"/>
-                <w:szCs w:val="20"/>
-                <w:rtl/>
-              </w:rPr>
-            </w:pPr>
-          </w:p>
-        </w:tc>
-        <w:tc>
-          <w:tcPr>
-            <w:tcW w:w="1573" w:type="pct"/>
-          </w:tcPr>
-          <w:p>
-            <w:pPr>
-              <w:tabs>
-                <w:tab w:val="left" w:pos="1692"/>
-                <w:tab w:val="center" w:pos="5256"/>
-              </w:tabs>
-              <w:bidi/>
-              <w:spacing w:after="0" w:line="240" w:lineRule="auto"/>
-              <w:ind w:right="162"/>
-              <w:rPr>
-                <w:rFonts w:ascii="Arial" w:hAnsi="Arial" w:cs="Arial"/>
-                <w:sz w:val="20"/>
-                <w:szCs w:val="20"/>
-                <w:rtl/>
-              </w:rPr>
-            </w:pPr>
-          </w:p>
-        </w:tc>
-        <w:tc>
-          <w:tcPr>
-            <w:tcW w:w="1649" w:type="pct"/>
-          </w:tcPr>
-          <w:p>
-            <w:pPr>
-              <w:tabs>
-                <w:tab w:val="left" w:pos="1692"/>
-                <w:tab w:val="center" w:pos="5256"/>
-              </w:tabs>
-              <w:bidi/>
-              <w:spacing w:after="0" w:line="240" w:lineRule="auto"/>
-              <w:ind w:right="162"/>
-              <w:rPr>
-                <w:rFonts w:ascii="Arial" w:hAnsi="Arial" w:cs="Arial"/>
-                <w:sz w:val="20"/>
-                <w:szCs w:val="20"/>
-                <w:rtl/>
-              </w:rPr>
-            </w:pPr>
-          </w:p>
-        </w:tc>
-      </w:tr>
-      <w:tr>
-        <w:trPr>
-          <w:trHeight w:val="265"/>
-        </w:trPr>
-        <w:tc>
-          <w:tcPr>
-            <w:tcW w:w="1778" w:type="pct"/>
-            <w:tcMar>
-              <w:top w:w="72" w:type="dxa"/>
-              <w:left w:w="144" w:type="dxa"/>
-              <w:bottom w:w="72" w:type="dxa"/>
-              <w:right w:w="144" w:type="dxa"/>
-            </w:tcMar>
-          </w:tcPr>
-          <w:p>
-            <w:pPr>
-              <w:tabs>
-                <w:tab w:val="left" w:pos="1692"/>
-                <w:tab w:val="center" w:pos="5256"/>
-              </w:tabs>
-              <w:bidi/>
-              <w:spacing w:after="0" w:line="240" w:lineRule="auto"/>
-              <w:ind w:right="162"/>
-              <w:rPr>
-                <w:rFonts w:ascii="Arial" w:hAnsi="Arial" w:cs="Arial"/>
-                <w:sz w:val="20"/>
-                <w:szCs w:val="20"/>
-                <w:rtl/>
-              </w:rPr>
-            </w:pPr>
-          </w:p>
-        </w:tc>
-        <w:tc>
-          <w:tcPr>
-            <w:tcW w:w="1573" w:type="pct"/>
-          </w:tcPr>
-          <w:p>
-            <w:pPr>
-              <w:tabs>
-                <w:tab w:val="left" w:pos="1692"/>
-                <w:tab w:val="center" w:pos="5256"/>
-              </w:tabs>
-              <w:bidi/>
-              <w:spacing w:after="0" w:line="240" w:lineRule="auto"/>
-              <w:ind w:right="162"/>
-              <w:rPr>
-                <w:rFonts w:ascii="Arial" w:hAnsi="Arial" w:cs="Arial"/>
-                <w:sz w:val="20"/>
-                <w:szCs w:val="20"/>
-                <w:rtl/>
-              </w:rPr>
-            </w:pPr>
-          </w:p>
-        </w:tc>
-        <w:tc>
-          <w:tcPr>
-            <w:tcW w:w="1649" w:type="pct"/>
-          </w:tcPr>
-          <w:p>
-            <w:pPr>
-              <w:tabs>
-                <w:tab w:val="left" w:pos="1692"/>
-                <w:tab w:val="center" w:pos="5256"/>
-              </w:tabs>
-              <w:bidi/>
-              <w:spacing w:after="0" w:line="240" w:lineRule="auto"/>
-              <w:ind w:right="162"/>
-              <w:rPr>
-                <w:rFonts w:ascii="Arial" w:hAnsi="Arial" w:cs="Arial"/>
-                <w:sz w:val="20"/>
-                <w:szCs w:val="20"/>
-                <w:rtl/>
-              </w:rPr>
-            </w:pPr>
-          </w:p>
-        </w:tc>
-      </w:tr>
-      <w:tr>
-        <w:trPr>
-          <w:trHeight w:val="265"/>
-        </w:trPr>
-        <w:tc>
-          <w:tcPr>
-            <w:tcW w:w="1778" w:type="pct"/>
-            <w:tcMar>
-              <w:top w:w="72" w:type="dxa"/>
-              <w:left w:w="144" w:type="dxa"/>
-              <w:bottom w:w="72" w:type="dxa"/>
-              <w:right w:w="144" w:type="dxa"/>
-            </w:tcMar>
-          </w:tcPr>
-          <w:p>
-            <w:pPr>
-              <w:tabs>
-                <w:tab w:val="left" w:pos="1692"/>
-                <w:tab w:val="center" w:pos="5256"/>
-              </w:tabs>
-              <w:bidi/>
-              <w:spacing w:after="0" w:line="240" w:lineRule="auto"/>
-              <w:ind w:right="162"/>
-              <w:rPr>
-                <w:rFonts w:ascii="Arial" w:hAnsi="Arial" w:cs="Arial"/>
-                <w:sz w:val="20"/>
-                <w:szCs w:val="20"/>
-                <w:rtl/>
-              </w:rPr>
-            </w:pPr>
-          </w:p>
-        </w:tc>
-        <w:tc>
-          <w:tcPr>
-            <w:tcW w:w="1573" w:type="pct"/>
-          </w:tcPr>
-          <w:p>
-            <w:pPr>
-              <w:tabs>
-                <w:tab w:val="left" w:pos="1692"/>
-              </w:tabs>
-              <w:bidi/>
-              <w:spacing w:after="0" w:line="240" w:lineRule="auto"/>
-              <w:ind w:right="162"/>
-              <w:rPr>
-                <w:rFonts w:ascii="Arial" w:hAnsi="Arial" w:cs="Arial"/>
-                <w:sz w:val="20"/>
-                <w:szCs w:val="20"/>
-                <w:rtl/>
-              </w:rPr>
-            </w:pPr>
-          </w:p>
-        </w:tc>
-        <w:tc>
-          <w:tcPr>
-            <w:tcW w:w="1649" w:type="pct"/>
-          </w:tcPr>
-          <w:p>
-            <w:pPr>
-              <w:tabs>
-                <w:tab w:val="left" w:pos="1692"/>
-              </w:tabs>
-              <w:bidi/>
-              <w:spacing w:after="0" w:line="240" w:lineRule="auto"/>
-              <w:ind w:right="162"/>
-              <w:rPr>
-                <w:rFonts w:ascii="Arial" w:hAnsi="Arial" w:cs="Arial"/>
-                <w:sz w:val="20"/>
-                <w:szCs w:val="20"/>
-                <w:rtl/>
-              </w:rPr>
-            </w:pPr>
+            <w:r>
+              <w:rPr>
+                <w:rFonts w:asciiTheme="majorBidi" w:hAnsiTheme="majorBidi" w:cstheme="majorBidi"/>
+              </w:rPr>
+              <w:t xml:space="preserve">{%tr </w:t>
+            </w:r>
+            <w:proofErr w:type="spellStart"/>
+            <w:r>
+              <w:rPr>
+                <w:rFonts w:asciiTheme="majorBidi" w:hAnsiTheme="majorBidi" w:cstheme="majorBidi"/>
+              </w:rPr>
+              <w:t>endfor</w:t>
+            </w:r>
+            <w:proofErr w:type="spellEnd"/>
+            <w:r>
+              <w:rPr>
+                <w:rFonts w:asciiTheme="majorBidi" w:hAnsiTheme="majorBidi" w:cstheme="majorBidi"/>
+              </w:rPr>
+              <w:t xml:space="preserve"> %}</w:t>
+            </w:r>
           </w:p>
         </w:tc>
       </w:tr>
@@ -1167,7 +939,7 @@
         <w:bidi/>
         <w:jc w:val="center"/>
         <w:rPr>
-          <w:rFonts w:ascii="Arial" w:hAnsi="Arial" w:cs="Arial"/>
+          <w:rFonts w:asciiTheme="majorBidi" w:hAnsiTheme="majorBidi" w:cstheme="majorBidi"/>
           <w:sz w:val="2"/>
           <w:szCs w:val="2"/>
           <w:rtl/>
@@ -1179,154 +951,48 @@
         <w:bidi/>
         <w:jc w:val="center"/>
         <w:rPr>
-          <w:rFonts w:ascii="Arial" w:hAnsi="Arial" w:cs="Arial"/>
+          <w:rFonts w:asciiTheme="majorBidi" w:hAnsiTheme="majorBidi" w:cstheme="majorBidi"/>
           <w:sz w:val="2"/>
           <w:szCs w:val="2"/>
           <w:rtl/>
         </w:rPr>
       </w:pPr>
     </w:p>
-    <w:tbl>
-      <w:tblPr>
-        <w:tblW w:w="4935" w:type="pct"/>
-        <w:tblInd w:w="137" w:type="dxa"/>
-        <w:tblBorders>
-          <w:top w:val="single" w:sz="4" w:space="0" w:color="866A3F" w:themeColor="accent4" w:themeShade="80"/>
-          <w:left w:val="single" w:sz="4" w:space="0" w:color="866A3F" w:themeColor="accent4" w:themeShade="80"/>
-          <w:bottom w:val="single" w:sz="4" w:space="0" w:color="866A3F" w:themeColor="accent4" w:themeShade="80"/>
-          <w:right w:val="single" w:sz="4" w:space="0" w:color="866A3F" w:themeColor="accent4" w:themeShade="80"/>
-          <w:insideH w:val="single" w:sz="4" w:space="0" w:color="866A3F" w:themeColor="accent4" w:themeShade="80"/>
-          <w:insideV w:val="single" w:sz="4" w:space="0" w:color="866A3F" w:themeColor="accent4" w:themeShade="80"/>
-        </w:tblBorders>
-        <w:tblCellMar>
-          <w:left w:w="0" w:type="dxa"/>
-          <w:right w:w="0" w:type="dxa"/>
-        </w:tblCellMar>
-        <w:tblLook w:val="0420" w:firstRow="1" w:lastRow="0" w:firstColumn="0" w:lastColumn="0" w:noHBand="0" w:noVBand="1"/>
-      </w:tblPr>
-      <w:tblGrid>
-        <w:gridCol w:w="10365"/>
-      </w:tblGrid>
-      <w:tr>
-        <w:trPr>
-          <w:trHeight w:val="287"/>
-        </w:trPr>
-        <w:tc>
-          <w:tcPr>
-            <w:tcW w:w="5000" w:type="pct"/>
-            <w:shd w:val="clear" w:color="auto" w:fill="1F3864"/>
-            <w:tcMar>
-              <w:top w:w="72" w:type="dxa"/>
-              <w:left w:w="144" w:type="dxa"/>
-              <w:bottom w:w="72" w:type="dxa"/>
-              <w:right w:w="144" w:type="dxa"/>
-            </w:tcMar>
-            <w:vAlign w:val="center"/>
-            <w:hideMark/>
-          </w:tcPr>
-          <w:p>
-            <w:pPr>
-              <w:tabs>
-                <w:tab w:val="left" w:pos="1692"/>
-                <w:tab w:val="center" w:pos="5256"/>
-              </w:tabs>
-              <w:bidi/>
-              <w:spacing w:after="0" w:line="240" w:lineRule="auto"/>
-              <w:ind w:right="162"/>
-              <w:jc w:val="center"/>
-              <w:rPr>
-                <w:rFonts w:ascii="Arial" w:hAnsi="Arial" w:cs="Arial"/>
-                <w:color w:val="FFFFFF" w:themeColor="background1"/>
-                <w:sz w:val="28"/>
-                <w:szCs w:val="28"/>
-              </w:rPr>
-            </w:pPr>
-            <w:r>
-              <w:rPr>
-                <w:rFonts w:ascii="Arial" w:hAnsi="Arial" w:cs="Arial"/>
-                <w:color w:val="FFFFFF" w:themeColor="background1"/>
-                <w:sz w:val="28"/>
-                <w:szCs w:val="28"/>
-                <w:rtl/>
-              </w:rPr>
-              <w:t>ال</w:t>
-            </w:r>
-            <w:r>
-              <w:rPr>
-                <w:rFonts w:ascii="Arial" w:hAnsi="Arial" w:cs="Arial"/>
-                <w:color w:val="FFFFFF" w:themeColor="background1"/>
-                <w:sz w:val="28"/>
-                <w:szCs w:val="28"/>
-                <w:rtl/>
-              </w:rPr>
-              <w:t xml:space="preserve">هدف </w:t>
-            </w:r>
-            <w:r>
-              <w:rPr>
-                <w:rFonts w:ascii="Arial" w:hAnsi="Arial" w:cs="Arial"/>
-                <w:color w:val="FFFFFF" w:themeColor="background1"/>
-                <w:sz w:val="28"/>
-                <w:szCs w:val="28"/>
-                <w:rtl/>
-              </w:rPr>
-              <w:t xml:space="preserve">من </w:t>
-            </w:r>
-            <w:r>
-              <w:rPr>
-                <w:rFonts w:ascii="Arial" w:hAnsi="Arial" w:cs="Arial"/>
-                <w:color w:val="FFFFFF" w:themeColor="background1"/>
-                <w:sz w:val="28"/>
-                <w:szCs w:val="28"/>
-                <w:rtl/>
-              </w:rPr>
-              <w:t>الاجتماع</w:t>
-            </w:r>
-          </w:p>
-        </w:tc>
-      </w:tr>
-      <w:tr>
-        <w:trPr>
-          <w:trHeight w:val="239"/>
-        </w:trPr>
-        <w:tc>
-          <w:tcPr>
-            <w:tcW w:w="5000" w:type="pct"/>
-            <w:tcMar>
-              <w:top w:w="72" w:type="dxa"/>
-              <w:left w:w="144" w:type="dxa"/>
-              <w:bottom w:w="72" w:type="dxa"/>
-              <w:right w:w="144" w:type="dxa"/>
-            </w:tcMar>
-            <w:vAlign w:val="center"/>
-          </w:tcPr>
-          <w:p>
-            <w:pPr>
-              <w:bidi/>
-              <w:spacing w:after="0" w:line="360" w:lineRule="auto"/>
-              <w:rPr>
-                <w:rFonts w:ascii="Arial" w:hAnsi="Arial" w:cs="Arial"/>
-                <w:sz w:val="20"/>
-                <w:szCs w:val="20"/>
-              </w:rPr>
-            </w:pPr>
-            <w:r>
-              <w:rPr>
-                <w:rFonts w:ascii="Arial" w:hAnsi="Arial" w:cs="Arial"/>
-                <w:sz w:val="20"/>
-                <w:szCs w:val="20"/>
-              </w:rPr>
-              <w:t>{{purpose}}</w:t>
-            </w:r>
-          </w:p>
-        </w:tc>
-      </w:tr>
-    </w:tbl>
+    <w:p>
+      <w:pPr>
+        <w:pBdr>
+          <w:bottom w:val="single" w:sz="6" w:space="1" w:color="2E75B6"/>
+        </w:pBdr>
+        <w:bidi/>
+        <w:spacing w:before="320"/>
+        <w:rPr>
+          <w:rFonts w:asciiTheme="majorBidi" w:hAnsiTheme="majorBidi" w:cstheme="majorBidi"/>
+          <w:sz w:val="32"/>
+          <w:szCs w:val="32"/>
+          <w:rtl/>
+          <w:lang w:bidi="ar-JO"/>
+        </w:rPr>
+      </w:pPr>
+      <w:r>
+        <w:rPr>
+          <w:rFonts w:asciiTheme="majorBidi" w:hAnsiTheme="majorBidi" w:cstheme="majorBidi"/>
+          <w:b/>
+          <w:bCs/>
+          <w:color w:val="1F3864"/>
+          <w:sz w:val="36"/>
+          <w:szCs w:val="36"/>
+          <w:rtl/>
+          <w:lang w:bidi="ar-JO"/>
+        </w:rPr>
+        <w:t>الهدف من الإجتماع</w:t>
+      </w:r>
+    </w:p>
     <w:p>
       <w:pPr>
         <w:bidi/>
         <w:jc w:val="center"/>
         <w:rPr>
-          <w:rFonts w:ascii="Arial" w:hAnsi="Arial" w:cs="Arial"/>
+          <w:rFonts w:asciiTheme="majorBidi" w:hAnsiTheme="majorBidi" w:cstheme="majorBidi"/>
           <w:sz w:val="2"/>
           <w:szCs w:val="2"/>
           <w:rtl/>
@@ -1336,124 +1002,201 @@
     <w:p>
       <w:pPr>
         <w:bidi/>
+        <w:spacing w:after="0" w:line="360" w:lineRule="auto"/>
+        <w:rPr>
+          <w:rFonts w:asciiTheme="majorBidi" w:hAnsiTheme="majorBidi" w:cstheme="majorBidi"/>
+          <w:sz w:val="20"/>
+          <w:szCs w:val="20"/>
+          <w:rtl/>
+        </w:rPr>
+      </w:pPr>
+      <w:r>
+        <w:rPr>
+          <w:rFonts w:asciiTheme="majorBidi" w:hAnsiTheme="majorBidi" w:cstheme="majorBidi"/>
+          <w:sz w:val="20"/>
+          <w:szCs w:val="20"/>
+        </w:rPr>
+        <w:t>{{purpose}}</w:t>
+      </w:r>
+    </w:p>
+    <w:p>
+      <w:pPr>
+        <w:pBdr>
+          <w:bottom w:val="single" w:sz="6" w:space="1" w:color="2E75B6"/>
+        </w:pBdr>
+        <w:bidi/>
+        <w:spacing w:before="320"/>
+        <w:rPr>
+          <w:rFonts w:asciiTheme="majorBidi" w:hAnsiTheme="majorBidi" w:cstheme="majorBidi"/>
+          <w:sz w:val="32"/>
+          <w:szCs w:val="32"/>
+          <w:rtl/>
+          <w:lang w:bidi="ar-JO"/>
+        </w:rPr>
+      </w:pPr>
+      <w:r>
+        <w:rPr>
+          <w:rFonts w:asciiTheme="majorBidi" w:hAnsiTheme="majorBidi" w:cstheme="majorBidi"/>
+          <w:b/>
+          <w:bCs/>
+          <w:color w:val="1F3864"/>
+          <w:sz w:val="36"/>
+          <w:szCs w:val="36"/>
+          <w:rtl/>
+          <w:lang w:bidi="ar-JO"/>
+        </w:rPr>
+        <w:t>نقاط النقاش الرئيسية</w:t>
+      </w:r>
+    </w:p>
+    <w:p>
+      <w:pPr>
+        <w:bidi/>
         <w:jc w:val="center"/>
         <w:rPr>
-          <w:rFonts w:ascii="Arial" w:hAnsi="Arial" w:cs="Arial"/>
+          <w:rFonts w:asciiTheme="majorBidi" w:hAnsiTheme="majorBidi" w:cstheme="majorBidi"/>
           <w:sz w:val="2"/>
           <w:szCs w:val="2"/>
           <w:rtl/>
         </w:rPr>
       </w:pPr>
     </w:p>
-    <w:tbl>
-      <w:tblPr>
-        <w:tblW w:w="4935" w:type="pct"/>
-        <w:tblInd w:w="137" w:type="dxa"/>
-        <w:tblBorders>
-          <w:top w:val="single" w:sz="4" w:space="0" w:color="866A3F" w:themeColor="accent4" w:themeShade="80"/>
-          <w:left w:val="single" w:sz="4" w:space="0" w:color="866A3F" w:themeColor="accent4" w:themeShade="80"/>
-          <w:bottom w:val="single" w:sz="4" w:space="0" w:color="866A3F" w:themeColor="accent4" w:themeShade="80"/>
-          <w:right w:val="single" w:sz="4" w:space="0" w:color="866A3F" w:themeColor="accent4" w:themeShade="80"/>
-          <w:insideH w:val="single" w:sz="4" w:space="0" w:color="866A3F" w:themeColor="accent4" w:themeShade="80"/>
-          <w:insideV w:val="single" w:sz="4" w:space="0" w:color="866A3F" w:themeColor="accent4" w:themeShade="80"/>
-        </w:tblBorders>
-        <w:tblCellMar>
-          <w:left w:w="0" w:type="dxa"/>
-          <w:right w:w="0" w:type="dxa"/>
-        </w:tblCellMar>
-        <w:tblLook w:val="0420" w:firstRow="1" w:lastRow="0" w:firstColumn="0" w:lastColumn="0" w:noHBand="0" w:noVBand="1"/>
-      </w:tblPr>
-      <w:tblGrid>
-        <w:gridCol w:w="10365"/>
-      </w:tblGrid>
-      <w:tr>
-        <w:trPr>
-          <w:trHeight w:val="176"/>
-        </w:trPr>
-        <w:tc>
-          <w:tcPr>
-            <w:tcW w:w="5000" w:type="pct"/>
-            <w:shd w:val="clear" w:color="auto" w:fill="1F3864"/>
-            <w:tcMar>
-              <w:top w:w="72" w:type="dxa"/>
-              <w:left w:w="144" w:type="dxa"/>
-              <w:bottom w:w="72" w:type="dxa"/>
-              <w:right w:w="144" w:type="dxa"/>
-            </w:tcMar>
-            <w:hideMark/>
-          </w:tcPr>
-          <w:p>
-            <w:pPr>
-              <w:tabs>
-                <w:tab w:val="left" w:pos="1692"/>
-                <w:tab w:val="center" w:pos="5256"/>
-              </w:tabs>
-              <w:bidi/>
-              <w:spacing w:after="0" w:line="240" w:lineRule="auto"/>
-              <w:ind w:right="162"/>
-              <w:jc w:val="center"/>
-              <w:rPr>
-                <w:rFonts w:ascii="Arial" w:hAnsi="Arial" w:cs="Arial"/>
-                <w:color w:val="FFFFFF" w:themeColor="background1"/>
-                <w:sz w:val="28"/>
-                <w:szCs w:val="28"/>
-              </w:rPr>
-            </w:pPr>
-            <w:r>
-              <w:rPr>
-                <w:rFonts w:ascii="Arial" w:hAnsi="Arial" w:cs="Arial"/>
-                <w:color w:val="FFFFFF" w:themeColor="background1"/>
-                <w:sz w:val="28"/>
-                <w:szCs w:val="28"/>
-                <w:rtl/>
-              </w:rPr>
-              <w:t>نقاط النقاش الرئيسية</w:t>
-            </w:r>
-          </w:p>
-        </w:tc>
-      </w:tr>
-      <w:tr>
-        <w:trPr>
-          <w:trHeight w:val="548"/>
-        </w:trPr>
-        <w:tc>
-          <w:tcPr>
-            <w:tcW w:w="5000" w:type="pct"/>
-            <w:tcMar>
-              <w:top w:w="72" w:type="dxa"/>
-              <w:left w:w="144" w:type="dxa"/>
-              <w:bottom w:w="72" w:type="dxa"/>
-              <w:right w:w="144" w:type="dxa"/>
-            </w:tcMar>
-          </w:tcPr>
-          <w:p>
-            <w:pPr>
-              <w:bidi/>
-              <w:spacing w:after="0" w:line="360" w:lineRule="auto"/>
-              <w:rPr>
-                <w:rFonts w:ascii="Arial" w:hAnsi="Arial" w:cs="Arial"/>
-                <w:sz w:val="20"/>
-                <w:szCs w:val="20"/>
-              </w:rPr>
-            </w:pPr>
-            <w:r>
-              <w:rPr>
-                <w:rFonts w:ascii="Arial" w:hAnsi="Arial" w:cs="Arial"/>
-                <w:sz w:val="20"/>
-                <w:szCs w:val="20"/>
-              </w:rPr>
-              <w:t>{{discussions}}</w:t>
-            </w:r>
-          </w:p>
-        </w:tc>
-      </w:tr>
-    </w:tbl>
+    <w:p>
+      <w:pPr>
+        <w:bidi/>
+        <w:spacing w:after="0" w:line="360" w:lineRule="auto"/>
+        <w:rPr>
+          <w:rFonts w:asciiTheme="majorBidi" w:hAnsiTheme="majorBidi" w:cstheme="majorBidi"/>
+          <w:sz w:val="2"/>
+          <w:szCs w:val="2"/>
+          <w:rtl/>
+        </w:rPr>
+      </w:pPr>
+      <w:r>
+        <w:rPr>
+          <w:rFonts w:asciiTheme="majorBidi" w:hAnsiTheme="majorBidi" w:cstheme="majorBidi"/>
+          <w:sz w:val="20"/>
+          <w:szCs w:val="20"/>
+        </w:rPr>
+        <w:t>{{</w:t>
+      </w:r>
+      <w:r>
+        <w:rPr>
+          <w:rFonts w:asciiTheme="majorBidi" w:hAnsiTheme="majorBidi" w:cstheme="majorBidi"/>
+          <w:sz w:val="20"/>
+          <w:szCs w:val="20"/>
+        </w:rPr>
+        <w:t xml:space="preserve"> </w:t>
+      </w:r>
+      <w:r>
+        <w:rPr>
+          <w:rFonts w:asciiTheme="majorBidi" w:hAnsiTheme="majorBidi" w:cstheme="majorBidi"/>
+          <w:sz w:val="20"/>
+          <w:szCs w:val="20"/>
+        </w:rPr>
+        <w:t>discussion }}</w:t>
+      </w:r>
+    </w:p>
+    <w:p>
+      <w:pPr>
+        <w:bidi/>
+        <w:spacing w:after="0" w:line="360" w:lineRule="auto"/>
+        <w:rPr>
+          <w:rFonts w:asciiTheme="majorBidi" w:hAnsiTheme="majorBidi" w:cstheme="majorBidi"/>
+          <w:sz w:val="2"/>
+          <w:szCs w:val="2"/>
+          <w:rtl/>
+        </w:rPr>
+      </w:pPr>
+    </w:p>
+    <w:p>
+      <w:pPr>
+        <w:bidi/>
+        <w:jc w:val="center"/>
+        <w:rPr>
+          <w:rFonts w:asciiTheme="majorBidi" w:hAnsiTheme="majorBidi" w:cstheme="majorBidi"/>
+          <w:sz w:val="2"/>
+          <w:szCs w:val="2"/>
+          <w:rtl/>
+        </w:rPr>
+      </w:pPr>
+    </w:p>
+    <w:p>
+      <w:pPr>
+        <w:pBdr>
+          <w:bottom w:val="single" w:sz="6" w:space="1" w:color="2E75B6"/>
+        </w:pBdr>
+        <w:bidi/>
+        <w:spacing w:before="320"/>
+        <w:rPr>
+          <w:rFonts w:asciiTheme="majorBidi" w:hAnsiTheme="majorBidi" w:cstheme="majorBidi"/>
+          <w:sz w:val="32"/>
+          <w:szCs w:val="32"/>
+          <w:rtl/>
+          <w:lang w:bidi="ar-JO"/>
+        </w:rPr>
+      </w:pPr>
+      <w:r>
+        <w:rPr>
+          <w:rFonts w:asciiTheme="majorBidi" w:hAnsiTheme="majorBidi" w:cstheme="majorBidi"/>
+          <w:b/>
+          <w:bCs/>
+          <w:color w:val="1F3864"/>
+          <w:sz w:val="36"/>
+          <w:szCs w:val="36"/>
+          <w:rtl/>
+          <w:lang w:bidi="ar-JO"/>
+        </w:rPr>
+        <w:t>القرارات</w:t>
+      </w:r>
+    </w:p>
+    <w:p>
+      <w:pPr>
+        <w:bidi/>
+        <w:spacing w:after="0" w:line="360" w:lineRule="auto"/>
+        <w:rPr>
+          <w:rFonts w:asciiTheme="majorBidi" w:hAnsiTheme="majorBidi" w:cstheme="majorBidi"/>
+          <w:sz w:val="20"/>
+          <w:szCs w:val="20"/>
+        </w:rPr>
+      </w:pPr>
+      <w:r>
+        <w:rPr>
+          <w:rFonts w:asciiTheme="majorBidi" w:hAnsiTheme="majorBidi" w:cstheme="majorBidi"/>
+          <w:sz w:val="20"/>
+          <w:szCs w:val="20"/>
+        </w:rPr>
+        <w:t>{{decisions}}</w:t>
+      </w:r>
+    </w:p>
     <w:p>
       <w:pPr>
         <w:bidi/>
         <w:jc w:val="right"/>
         <w:rPr>
-          <w:rFonts w:ascii="Arial" w:hAnsi="Arial" w:cs="Arial"/>
+          <w:rFonts w:asciiTheme="majorBidi" w:hAnsiTheme="majorBidi" w:cstheme="majorBidi"/>
+          <w:sz w:val="20"/>
+          <w:szCs w:val="20"/>
+          <w:lang w:bidi="ar-JO"/>
+        </w:rPr>
+      </w:pPr>
+    </w:p>
+    <w:p>
+      <w:pPr>
+        <w:bidi/>
+        <w:jc w:val="right"/>
+        <w:rPr>
+          <w:rFonts w:asciiTheme="majorBidi" w:hAnsiTheme="majorBidi" w:cstheme="majorBidi"/>
+          <w:sz w:val="20"/>
+          <w:szCs w:val="20"/>
+        </w:rPr>
+      </w:pPr>
+    </w:p>
+    <w:p>
+      <w:pPr>
+        <w:bidi/>
+        <w:jc w:val="right"/>
+        <w:rPr>
+          <w:rFonts w:asciiTheme="majorBidi" w:hAnsiTheme="majorBidi" w:cstheme="majorBidi"/>
           <w:sz w:val="20"/>
           <w:szCs w:val="20"/>
           <w:rtl/>
@@ -1507,7 +1250,7 @@
               <w:ind w:right="162"/>
               <w:jc w:val="center"/>
               <w:rPr>
-                <w:rFonts w:ascii="Arial" w:hAnsi="Arial" w:cs="Arial"/>
+                <w:rFonts w:asciiTheme="majorBidi" w:hAnsiTheme="majorBidi" w:cstheme="majorBidi"/>
                 <w:color w:val="FFFFFF" w:themeColor="background1"/>
                 <w:sz w:val="28"/>
                 <w:szCs w:val="28"/>
@@ -1516,7 +1259,7 @@
             </w:pPr>
             <w:r>
               <w:rPr>
-                <w:rFonts w:ascii="Arial" w:hAnsi="Arial" w:cs="Arial"/>
+                <w:rFonts w:asciiTheme="majorBidi" w:hAnsiTheme="majorBidi" w:cstheme="majorBidi"/>
                 <w:color w:val="FFFFFF" w:themeColor="background1"/>
                 <w:sz w:val="28"/>
                 <w:szCs w:val="28"/>
@@ -1550,7 +1293,7 @@
               <w:ind w:right="162"/>
               <w:jc w:val="center"/>
               <w:rPr>
-                <w:rFonts w:ascii="Arial" w:hAnsi="Arial" w:cs="Arial"/>
+                <w:rFonts w:asciiTheme="majorBidi" w:hAnsiTheme="majorBidi" w:cstheme="majorBidi"/>
                 <w:color w:val="FFFFFF" w:themeColor="background1"/>
                 <w:sz w:val="28"/>
                 <w:szCs w:val="28"/>
@@ -1558,7 +1301,7 @@
             </w:pPr>
             <w:r>
               <w:rPr>
-                <w:rFonts w:ascii="Arial" w:hAnsi="Arial" w:cs="Arial"/>
+                <w:rFonts w:asciiTheme="majorBidi" w:hAnsiTheme="majorBidi" w:cstheme="majorBidi"/>
                 <w:color w:val="FFFFFF" w:themeColor="background1"/>
                 <w:sz w:val="28"/>
                 <w:szCs w:val="28"/>
@@ -1585,7 +1328,7 @@
               <w:ind w:right="162"/>
               <w:jc w:val="center"/>
               <w:rPr>
-                <w:rFonts w:ascii="Arial" w:hAnsi="Arial" w:cs="Arial"/>
+                <w:rFonts w:asciiTheme="majorBidi" w:hAnsiTheme="majorBidi" w:cstheme="majorBidi"/>
                 <w:color w:val="FFFFFF" w:themeColor="background1"/>
                 <w:sz w:val="28"/>
                 <w:szCs w:val="28"/>
@@ -1593,7 +1336,7 @@
             </w:pPr>
             <w:r>
               <w:rPr>
-                <w:rFonts w:ascii="Arial" w:hAnsi="Arial" w:cs="Arial"/>
+                <w:rFonts w:asciiTheme="majorBidi" w:hAnsiTheme="majorBidi" w:cstheme="majorBidi"/>
                 <w:color w:val="FFFFFF" w:themeColor="background1"/>
                 <w:sz w:val="28"/>
                 <w:szCs w:val="28"/>
@@ -1620,7 +1363,7 @@
               <w:ind w:right="162"/>
               <w:jc w:val="center"/>
               <w:rPr>
-                <w:rFonts w:ascii="Arial" w:hAnsi="Arial" w:cs="Arial"/>
+                <w:rFonts w:asciiTheme="majorBidi" w:hAnsiTheme="majorBidi" w:cstheme="majorBidi"/>
                 <w:color w:val="FFFFFF" w:themeColor="background1"/>
                 <w:sz w:val="28"/>
                 <w:szCs w:val="28"/>
@@ -1629,7 +1372,7 @@
             </w:pPr>
             <w:r>
               <w:rPr>
-                <w:rFonts w:ascii="Arial" w:hAnsi="Arial" w:cs="Arial"/>
+                <w:rFonts w:asciiTheme="majorBidi" w:hAnsiTheme="majorBidi" w:cstheme="majorBidi"/>
                 <w:color w:val="FFFFFF" w:themeColor="background1"/>
                 <w:sz w:val="28"/>
                 <w:szCs w:val="28"/>
@@ -1656,7 +1399,7 @@
               <w:ind w:right="162"/>
               <w:jc w:val="center"/>
               <w:rPr>
-                <w:rFonts w:ascii="Arial" w:hAnsi="Arial" w:cs="Arial"/>
+                <w:rFonts w:asciiTheme="majorBidi" w:hAnsiTheme="majorBidi" w:cstheme="majorBidi"/>
                 <w:color w:val="FFFFFF" w:themeColor="background1"/>
                 <w:sz w:val="28"/>
                 <w:szCs w:val="28"/>
@@ -1665,7 +1408,7 @@
             </w:pPr>
             <w:r>
               <w:rPr>
-                <w:rFonts w:ascii="Arial" w:hAnsi="Arial" w:cs="Arial"/>
+                <w:rFonts w:asciiTheme="majorBidi" w:hAnsiTheme="majorBidi" w:cstheme="majorBidi"/>
                 <w:color w:val="FFFFFF" w:themeColor="background1"/>
                 <w:sz w:val="28"/>
                 <w:szCs w:val="28"/>
@@ -1696,7 +1439,7 @@
               <w:ind w:right="162"/>
               <w:jc w:val="center"/>
               <w:rPr>
-                <w:rFonts w:ascii="Arial" w:hAnsi="Arial" w:cs="Arial"/>
+                <w:rFonts w:asciiTheme="majorBidi" w:hAnsiTheme="majorBidi" w:cstheme="majorBidi"/>
                 <w:sz w:val="20"/>
                 <w:szCs w:val="20"/>
                 <w:rtl/>
@@ -1726,7 +1469,7 @@
               <w:spacing w:after="0" w:line="240" w:lineRule="auto"/>
               <w:ind w:right="162"/>
               <w:rPr>
-                <w:rFonts w:ascii="Arial" w:hAnsi="Arial" w:cs="Arial"/>
+                <w:rFonts w:asciiTheme="majorBidi" w:hAnsiTheme="majorBidi" w:cstheme="majorBidi"/>
                 <w:sz w:val="20"/>
                 <w:szCs w:val="20"/>
                 <w:rtl/>
@@ -1749,7 +1492,7 @@
               <w:spacing w:after="0" w:line="240" w:lineRule="auto"/>
               <w:ind w:right="162"/>
               <w:rPr>
-                <w:rFonts w:ascii="Arial" w:hAnsi="Arial" w:cs="Arial"/>
+                <w:rFonts w:asciiTheme="majorBidi" w:hAnsiTheme="majorBidi" w:cstheme="majorBidi"/>
                 <w:sz w:val="20"/>
                 <w:szCs w:val="20"/>
                 <w:rtl/>
@@ -1772,7 +1515,7 @@
               <w:spacing w:after="0" w:line="240" w:lineRule="auto"/>
               <w:ind w:left="136" w:right="162"/>
               <w:rPr>
-                <w:rFonts w:ascii="Arial" w:hAnsi="Arial" w:cs="Arial"/>
+                <w:rFonts w:asciiTheme="majorBidi" w:hAnsiTheme="majorBidi" w:cstheme="majorBidi"/>
                 <w:sz w:val="20"/>
                 <w:szCs w:val="20"/>
                 <w:rtl/>
@@ -1780,7 +1523,7 @@
             </w:pPr>
             <w:r>
               <w:rPr>
-                <w:rFonts w:ascii="Arial" w:hAnsi="Arial" w:cs="Arial"/>
+                <w:rFonts w:asciiTheme="majorBidi" w:hAnsiTheme="majorBidi" w:cstheme="majorBidi"/>
                 <w:sz w:val="20"/>
                 <w:szCs w:val="20"/>
                 <w:lang w:val="en-GB"/>
@@ -1790,7 +1533,7 @@
             <w:proofErr w:type="spellStart"/>
             <w:r>
               <w:rPr>
-                <w:rFonts w:ascii="Arial" w:hAnsi="Arial" w:cs="Arial"/>
+                <w:rFonts w:asciiTheme="majorBidi" w:hAnsiTheme="majorBidi" w:cstheme="majorBidi"/>
                 <w:sz w:val="20"/>
                 <w:szCs w:val="20"/>
                 <w:lang w:val="en-GB"/>
@@ -1800,7 +1543,7 @@
             <w:proofErr w:type="spellEnd"/>
             <w:r>
               <w:rPr>
-                <w:rFonts w:ascii="Arial" w:hAnsi="Arial" w:cs="Arial"/>
+                <w:rFonts w:asciiTheme="majorBidi" w:hAnsiTheme="majorBidi" w:cstheme="majorBidi"/>
                 <w:sz w:val="20"/>
                 <w:szCs w:val="20"/>
                 <w:lang w:val="en-GB"/>
@@ -1830,7 +1573,7 @@
               <w:ind w:right="162"/>
               <w:jc w:val="center"/>
               <w:rPr>
-                <w:rFonts w:ascii="Arial" w:hAnsi="Arial" w:cs="Arial"/>
+                <w:rFonts w:asciiTheme="majorBidi" w:hAnsiTheme="majorBidi" w:cstheme="majorBidi"/>
                 <w:sz w:val="20"/>
                 <w:szCs w:val="20"/>
                 <w:rtl/>
@@ -1859,7 +1602,7 @@
               <w:ind w:right="162"/>
               <w:jc w:val="center"/>
               <w:rPr>
-                <w:rFonts w:ascii="Arial" w:hAnsi="Arial" w:cs="Arial"/>
+                <w:rFonts w:asciiTheme="majorBidi" w:hAnsiTheme="majorBidi" w:cstheme="majorBidi"/>
                 <w:sz w:val="20"/>
                 <w:szCs w:val="20"/>
                 <w:rtl/>
@@ -1888,7 +1631,7 @@
               <w:spacing w:after="0" w:line="240" w:lineRule="auto"/>
               <w:ind w:right="162"/>
               <w:rPr>
-                <w:rFonts w:ascii="Arial" w:hAnsi="Arial" w:cs="Arial"/>
+                <w:rFonts w:asciiTheme="majorBidi" w:hAnsiTheme="majorBidi" w:cstheme="majorBidi"/>
                 <w:sz w:val="20"/>
                 <w:szCs w:val="20"/>
                 <w:rtl/>
@@ -1896,7 +1639,7 @@
             </w:pPr>
             <w:r>
               <w:rPr>
-                <w:rFonts w:ascii="Arial" w:hAnsi="Arial" w:cs="Arial"/>
+                <w:rFonts w:asciiTheme="majorBidi" w:hAnsiTheme="majorBidi" w:cstheme="majorBidi"/>
                 <w:sz w:val="20"/>
                 <w:szCs w:val="20"/>
               </w:rPr>
@@ -1905,7 +1648,7 @@
             <w:proofErr w:type="spellStart"/>
             <w:r>
               <w:rPr>
-                <w:rFonts w:ascii="Arial" w:hAnsi="Arial" w:cs="Arial"/>
+                <w:rFonts w:asciiTheme="majorBidi" w:hAnsiTheme="majorBidi" w:cstheme="majorBidi"/>
                 <w:sz w:val="20"/>
                 <w:szCs w:val="20"/>
               </w:rPr>
@@ -1914,7 +1657,7 @@
             <w:proofErr w:type="spellEnd"/>
             <w:r>
               <w:rPr>
-                <w:rFonts w:ascii="Arial" w:hAnsi="Arial" w:cs="Arial"/>
+                <w:rFonts w:asciiTheme="majorBidi" w:hAnsiTheme="majorBidi" w:cstheme="majorBidi"/>
                 <w:sz w:val="20"/>
                 <w:szCs w:val="20"/>
               </w:rPr>
@@ -1937,7 +1680,7 @@
               <w:spacing w:after="0" w:line="240" w:lineRule="auto"/>
               <w:ind w:right="162"/>
               <w:rPr>
-                <w:rFonts w:ascii="Arial" w:hAnsi="Arial" w:cs="Arial"/>
+                <w:rFonts w:asciiTheme="majorBidi" w:hAnsiTheme="majorBidi" w:cstheme="majorBidi"/>
                 <w:sz w:val="20"/>
                 <w:szCs w:val="20"/>
                 <w:rtl/>
@@ -1945,7 +1688,7 @@
             </w:pPr>
             <w:r>
               <w:rPr>
-                <w:rFonts w:ascii="Arial" w:hAnsi="Arial" w:cs="Arial"/>
+                <w:rFonts w:asciiTheme="majorBidi" w:hAnsiTheme="majorBidi" w:cstheme="majorBidi"/>
                 <w:sz w:val="20"/>
                 <w:szCs w:val="20"/>
               </w:rPr>
@@ -1954,7 +1697,7 @@
             <w:proofErr w:type="spellStart"/>
             <w:r>
               <w:rPr>
-                <w:rFonts w:ascii="Arial" w:hAnsi="Arial" w:cs="Arial"/>
+                <w:rFonts w:asciiTheme="majorBidi" w:hAnsiTheme="majorBidi" w:cstheme="majorBidi"/>
                 <w:sz w:val="20"/>
                 <w:szCs w:val="20"/>
               </w:rPr>
@@ -1963,7 +1706,7 @@
             <w:proofErr w:type="spellEnd"/>
             <w:r>
               <w:rPr>
-                <w:rFonts w:ascii="Arial" w:hAnsi="Arial" w:cs="Arial"/>
+                <w:rFonts w:asciiTheme="majorBidi" w:hAnsiTheme="majorBidi" w:cstheme="majorBidi"/>
                 <w:sz w:val="20"/>
                 <w:szCs w:val="20"/>
               </w:rPr>
@@ -1986,7 +1729,7 @@
               <w:spacing w:after="0" w:line="240" w:lineRule="auto"/>
               <w:ind w:left="136" w:right="162"/>
               <w:rPr>
-                <w:rFonts w:ascii="Arial" w:hAnsi="Arial" w:cs="Arial"/>
+                <w:rFonts w:asciiTheme="majorBidi" w:hAnsiTheme="majorBidi" w:cstheme="majorBidi"/>
                 <w:sz w:val="20"/>
                 <w:szCs w:val="20"/>
                 <w:rtl/>
@@ -1994,7 +1737,7 @@
             </w:pPr>
             <w:r>
               <w:rPr>
-                <w:rFonts w:ascii="Arial" w:hAnsi="Arial" w:cs="Arial"/>
+                <w:rFonts w:asciiTheme="majorBidi" w:hAnsiTheme="majorBidi" w:cstheme="majorBidi"/>
                 <w:sz w:val="20"/>
                 <w:szCs w:val="20"/>
               </w:rPr>
@@ -2003,7 +1746,7 @@
             <w:proofErr w:type="spellStart"/>
             <w:r>
               <w:rPr>
-                <w:rFonts w:ascii="Arial" w:hAnsi="Arial" w:cs="Arial"/>
+                <w:rFonts w:asciiTheme="majorBidi" w:hAnsiTheme="majorBidi" w:cstheme="majorBidi"/>
                 <w:sz w:val="20"/>
                 <w:szCs w:val="20"/>
               </w:rPr>
@@ -2012,7 +1755,7 @@
             <w:proofErr w:type="spellEnd"/>
             <w:r>
               <w:rPr>
-                <w:rFonts w:ascii="Arial" w:hAnsi="Arial" w:cs="Arial"/>
+                <w:rFonts w:asciiTheme="majorBidi" w:hAnsiTheme="majorBidi" w:cstheme="majorBidi"/>
                 <w:sz w:val="20"/>
                 <w:szCs w:val="20"/>
               </w:rPr>
@@ -2041,7 +1784,7 @@
               <w:ind w:right="162"/>
               <w:jc w:val="center"/>
               <w:rPr>
-                <w:rFonts w:ascii="Arial" w:hAnsi="Arial" w:cs="Arial"/>
+                <w:rFonts w:asciiTheme="majorBidi" w:hAnsiTheme="majorBidi" w:cstheme="majorBidi"/>
                 <w:sz w:val="20"/>
                 <w:szCs w:val="20"/>
                 <w:rtl/>
@@ -2070,7 +1813,7 @@
               <w:ind w:right="162"/>
               <w:jc w:val="center"/>
               <w:rPr>
-                <w:rFonts w:ascii="Arial" w:hAnsi="Arial" w:cs="Arial"/>
+                <w:rFonts w:asciiTheme="majorBidi" w:hAnsiTheme="majorBidi" w:cstheme="majorBidi"/>
                 <w:sz w:val="20"/>
                 <w:szCs w:val="20"/>
               </w:rPr>
@@ -2098,7 +1841,7 @@
               <w:spacing w:after="0" w:line="240" w:lineRule="auto"/>
               <w:ind w:right="162"/>
               <w:rPr>
-                <w:rFonts w:ascii="Arial" w:hAnsi="Arial" w:cs="Arial"/>
+                <w:rFonts w:asciiTheme="majorBidi" w:hAnsiTheme="majorBidi" w:cstheme="majorBidi"/>
                 <w:sz w:val="20"/>
                 <w:szCs w:val="20"/>
               </w:rPr>
@@ -2120,7 +1863,7 @@
               <w:spacing w:after="0" w:line="240" w:lineRule="auto"/>
               <w:ind w:right="162"/>
               <w:rPr>
-                <w:rFonts w:ascii="Arial" w:hAnsi="Arial" w:cs="Arial"/>
+                <w:rFonts w:asciiTheme="majorBidi" w:hAnsiTheme="majorBidi" w:cstheme="majorBidi"/>
                 <w:sz w:val="20"/>
                 <w:szCs w:val="20"/>
               </w:rPr>
@@ -2142,7 +1885,7 @@
               <w:spacing w:after="0" w:line="240" w:lineRule="auto"/>
               <w:ind w:left="136" w:right="162"/>
               <w:rPr>
-                <w:rFonts w:ascii="Arial" w:hAnsi="Arial" w:cs="Arial"/>
+                <w:rFonts w:asciiTheme="majorBidi" w:hAnsiTheme="majorBidi" w:cstheme="majorBidi"/>
                 <w:sz w:val="20"/>
                 <w:szCs w:val="20"/>
                 <w:rtl/>
@@ -2150,7 +1893,7 @@
             </w:pPr>
             <w:r>
               <w:rPr>
-                <w:rFonts w:ascii="Arial" w:hAnsi="Arial" w:cs="Arial"/>
+                <w:rFonts w:asciiTheme="majorBidi" w:hAnsiTheme="majorBidi" w:cstheme="majorBidi"/>
                 <w:sz w:val="20"/>
                 <w:szCs w:val="20"/>
               </w:rPr>
@@ -2159,7 +1902,7 @@
             <w:proofErr w:type="spellStart"/>
             <w:r>
               <w:rPr>
-                <w:rFonts w:ascii="Arial" w:hAnsi="Arial" w:cs="Arial"/>
+                <w:rFonts w:asciiTheme="majorBidi" w:hAnsiTheme="majorBidi" w:cstheme="majorBidi"/>
                 <w:sz w:val="20"/>
                 <w:szCs w:val="20"/>
               </w:rPr>
@@ -2168,7 +1911,7 @@
             <w:proofErr w:type="spellEnd"/>
             <w:r>
               <w:rPr>
-                <w:rFonts w:ascii="Arial" w:hAnsi="Arial" w:cs="Arial"/>
+                <w:rFonts w:asciiTheme="majorBidi" w:hAnsiTheme="majorBidi" w:cstheme="majorBidi"/>
                 <w:sz w:val="20"/>
                 <w:szCs w:val="20"/>
               </w:rPr>
@@ -2197,7 +1940,7 @@
               <w:ind w:right="162"/>
               <w:jc w:val="center"/>
               <w:rPr>
-                <w:rFonts w:ascii="Arial" w:hAnsi="Arial" w:cs="Arial"/>
+                <w:rFonts w:asciiTheme="majorBidi" w:hAnsiTheme="majorBidi" w:cstheme="majorBidi"/>
                 <w:sz w:val="20"/>
                 <w:szCs w:val="20"/>
                 <w:rtl/>
@@ -2211,7 +1954,7 @@
       <w:pPr>
         <w:bidi/>
         <w:rPr>
-          <w:rFonts w:ascii="Arial" w:hAnsi="Arial" w:cs="Arial"/>
+          <w:rFonts w:asciiTheme="majorBidi" w:hAnsiTheme="majorBidi" w:cstheme="majorBidi"/>
         </w:rPr>
       </w:pPr>
     </w:p>
@@ -4239,7 +3982,7 @@
   <w:style w:type="paragraph" w:default="1" w:styleId="Normal">
     <w:name w:val="Normal"/>
     <w:qFormat/>
-    <w:rsid w:val="009D0F8F"/>
+    <w:rsid w:val="009345FF"/>
   </w:style>
   <w:style w:type="character" w:default="1" w:styleId="DefaultParagraphFont">
     <w:name w:val="Default Paragraph Font"/>
@@ -4802,6 +4545,30 @@
 </file>
 
 <file path=customXml/item1.xml><?xml version="1.0" encoding="utf-8"?>
+<b:Sources xmlns:b="http://schemas.openxmlformats.org/officeDocument/2006/bibliography" xmlns="http://schemas.openxmlformats.org/officeDocument/2006/bibliography" SelectedStyle="\APASixthEditionOfficeOnline.xsl" StyleName="APA" Version="6"/>
+</file>
+
+<file path=customXml/item2.xml><?xml version="1.0" encoding="utf-8"?>
+<p:properties xmlns:p="http://schemas.microsoft.com/office/2006/metadata/properties" xmlns:xsi="http://www.w3.org/2001/XMLSchema-instance" xmlns:pc="http://schemas.microsoft.com/office/infopath/2007/PartnerControls">
+  <documentManagement>
+    <lcf76f155ced4ddcb4097134ff3c332f xmlns="7260ee0e-cdb6-4ab4-88d8-88d8fa0cdbf8">
+      <Terms xmlns="http://schemas.microsoft.com/office/infopath/2007/PartnerControls"/>
+    </lcf76f155ced4ddcb4097134ff3c332f>
+    <TaxCatchAll xmlns="59975272-0bad-400b-9cef-9cc26dcf7ffe" xsi:nil="true"/>
+  </documentManagement>
+</p:properties>
+</file>
+
+<file path=customXml/item3.xml><?xml version="1.0" encoding="utf-8"?>
+<?mso-contentType ?>
+<FormTemplates xmlns="http://schemas.microsoft.com/sharepoint/v3/contenttype/forms">
+  <Display>DocumentLibraryForm</Display>
+  <Edit>DocumentLibraryForm</Edit>
+  <New>DocumentLibraryForm</New>
+</FormTemplates>
+</file>
+
+<file path=customXml/item4.xml><?xml version="1.0" encoding="utf-8"?>
 <ct:contentTypeSchema xmlns:ct="http://schemas.microsoft.com/office/2006/metadata/contentType" xmlns:ma="http://schemas.microsoft.com/office/2006/metadata/properties/metaAttributes" ct:_="" ma:_="" ma:contentTypeName="Document" ma:contentTypeID="0x0101007E34F50072881F409839E7C4D09BBCA2" ma:contentTypeVersion="13" ma:contentTypeDescription="Create a new document." ma:contentTypeScope="" ma:versionID="ca84aa07066ed80fbe0016d9d5692e17">
   <xsd:schema xmlns:xsd="http://www.w3.org/2001/XMLSchema" xmlns:xs="http://www.w3.org/2001/XMLSchema" xmlns:p="http://schemas.microsoft.com/office/2006/metadata/properties" xmlns:ns2="7260ee0e-cdb6-4ab4-88d8-88d8fa0cdbf8" xmlns:ns3="59975272-0bad-400b-9cef-9cc26dcf7ffe" targetNamespace="http://schemas.microsoft.com/office/2006/metadata/properties" ma:root="true" ma:fieldsID="eb7ccfc88d72bb3807af459e65e9d13b" ns2:_="" ns3:_="">
     <xsd:import namespace="7260ee0e-cdb6-4ab4-88d8-88d8fa0cdbf8"/>
@@ -5008,31 +4775,34 @@
 </ct:contentTypeSchema>
 </file>
 
-<file path=customXml/item2.xml><?xml version="1.0" encoding="utf-8"?>
-<?mso-contentType ?>
-<FormTemplates xmlns="http://schemas.microsoft.com/sharepoint/v3/contenttype/forms">
-  <Display>DocumentLibraryForm</Display>
-  <Edit>DocumentLibraryForm</Edit>
-  <New>DocumentLibraryForm</New>
-</FormTemplates>
+<file path=customXml/itemProps1.xml><?xml version="1.0" encoding="utf-8"?>
+<ds:datastoreItem xmlns:ds="http://schemas.openxmlformats.org/officeDocument/2006/customXml" ds:itemID="{8AA13928-7109-4E06-9E2E-C03F885D1F3A}">
+  <ds:schemaRefs>
+    <ds:schemaRef ds:uri="http://schemas.openxmlformats.org/officeDocument/2006/bibliography"/>
+  </ds:schemaRefs>
+</ds:datastoreItem>
 </file>
 
-<file path=customXml/item3.xml><?xml version="1.0" encoding="utf-8"?>
-<p:properties xmlns:p="http://schemas.microsoft.com/office/2006/metadata/properties" xmlns:xsi="http://www.w3.org/2001/XMLSchema-instance" xmlns:pc="http://schemas.microsoft.com/office/infopath/2007/PartnerControls">
-  <documentManagement>
-    <lcf76f155ced4ddcb4097134ff3c332f xmlns="7260ee0e-cdb6-4ab4-88d8-88d8fa0cdbf8">
-      <Terms xmlns="http://schemas.microsoft.com/office/infopath/2007/PartnerControls"/>
-    </lcf76f155ced4ddcb4097134ff3c332f>
-    <TaxCatchAll xmlns="59975272-0bad-400b-9cef-9cc26dcf7ffe" xsi:nil="true"/>
-  </documentManagement>
-</p:properties>
+<file path=customXml/itemProps2.xml><?xml version="1.0" encoding="utf-8"?>
+<ds:datastoreItem xmlns:ds="http://schemas.openxmlformats.org/officeDocument/2006/customXml" ds:itemID="{A9E457AB-279D-4C70-81A5-79B1E219B9C6}">
+  <ds:schemaRefs>
+    <ds:schemaRef ds:uri="http://schemas.microsoft.com/office/2006/metadata/properties"/>
+    <ds:schemaRef ds:uri="http://schemas.microsoft.com/office/infopath/2007/PartnerControls"/>
+    <ds:schemaRef ds:uri="7260ee0e-cdb6-4ab4-88d8-88d8fa0cdbf8"/>
+    <ds:schemaRef ds:uri="59975272-0bad-400b-9cef-9cc26dcf7ffe"/>
+  </ds:schemaRefs>
+</ds:datastoreItem>
 </file>
 
-<file path=customXml/item4.xml><?xml version="1.0" encoding="utf-8"?>
-<b:Sources xmlns:b="http://schemas.openxmlformats.org/officeDocument/2006/bibliography" xmlns="http://schemas.openxmlformats.org/officeDocument/2006/bibliography" SelectedStyle="\APASixthEditionOfficeOnline.xsl" StyleName="APA" Version="6"/>
+<file path=customXml/itemProps3.xml><?xml version="1.0" encoding="utf-8"?>
+<ds:datastoreItem xmlns:ds="http://schemas.openxmlformats.org/officeDocument/2006/customXml" ds:itemID="{FEA58E5F-2EB4-4879-AC15-A30D67E1E9FF}">
+  <ds:schemaRefs>
+    <ds:schemaRef ds:uri="http://schemas.microsoft.com/sharepoint/v3/contenttype/forms"/>
+  </ds:schemaRefs>
+</ds:datastoreItem>
 </file>
 
-<file path=customXml/itemProps1.xml><?xml version="1.0" encoding="utf-8"?>
+<file path=customXml/itemProps4.xml><?xml version="1.0" encoding="utf-8"?>
 <ds:datastoreItem xmlns:ds="http://schemas.openxmlformats.org/officeDocument/2006/customXml" ds:itemID="{F20EC7E6-828D-4A66-AD6E-99590BABCB83}">
   <ds:schemaRefs>
     <ds:schemaRef ds:uri="http://schemas.microsoft.com/office/2006/metadata/contentType"/>
@@ -5051,33 +4821,6 @@
 </ds:datastoreItem>
 </file>
 
-<file path=customXml/itemProps2.xml><?xml version="1.0" encoding="utf-8"?>
-<ds:datastoreItem xmlns:ds="http://schemas.openxmlformats.org/officeDocument/2006/customXml" ds:itemID="{FEA58E5F-2EB4-4879-AC15-A30D67E1E9FF}">
-  <ds:schemaRefs>
-    <ds:schemaRef ds:uri="http://schemas.microsoft.com/sharepoint/v3/contenttype/forms"/>
-  </ds:schemaRefs>
-</ds:datastoreItem>
-</file>
-
-<file path=customXml/itemProps3.xml><?xml version="1.0" encoding="utf-8"?>
-<ds:datastoreItem xmlns:ds="http://schemas.openxmlformats.org/officeDocument/2006/customXml" ds:itemID="{A9E457AB-279D-4C70-81A5-79B1E219B9C6}">
-  <ds:schemaRefs>
-    <ds:schemaRef ds:uri="http://schemas.microsoft.com/office/2006/metadata/properties"/>
-    <ds:schemaRef ds:uri="http://schemas.microsoft.com/office/infopath/2007/PartnerControls"/>
-    <ds:schemaRef ds:uri="7260ee0e-cdb6-4ab4-88d8-88d8fa0cdbf8"/>
-    <ds:schemaRef ds:uri="59975272-0bad-400b-9cef-9cc26dcf7ffe"/>
-  </ds:schemaRefs>
-</ds:datastoreItem>
-</file>
-
-<file path=customXml/itemProps4.xml><?xml version="1.0" encoding="utf-8"?>
-<ds:datastoreItem xmlns:ds="http://schemas.openxmlformats.org/officeDocument/2006/customXml" ds:itemID="{8AA13928-7109-4E06-9E2E-C03F885D1F3A}">
-  <ds:schemaRefs>
-    <ds:schemaRef ds:uri="http://schemas.openxmlformats.org/officeDocument/2006/bibliography"/>
-  </ds:schemaRefs>
-</ds:datastoreItem>
-</file>
-
 <file path=docMetadata/LabelInfo.xml><?xml version="1.0" encoding="utf-8"?>
 <clbl:labelList xmlns:clbl="http://schemas.microsoft.com/office/2020/mipLabelMetadata">
   <clbl:label id="{deff24bb-2089-4400-8c8e-f71e680378b2}" enabled="0" method="" siteId="{deff24bb-2089-4400-8c8e-f71e680378b2}" removed="1"/>

</xml_diff>